<commit_message>
feat(reports): engrave official MDRRMO signature block at the bottom of each page
</commit_message>
<xml_diff>
--- a/public/templates/monthly-template.docx
+++ b/public/templates/monthly-template.docx
@@ -182,224 +182,6 @@
         <w:spacing w:after="120" w:line="240" w:lineRule="auto"/>
       </w:pPr>
     </w:p>
-    <w:tbl>
-      <w:tblPr>
-        <w:tblW w:w="9360" w:type="dxa"/>
-        <w:tblBorders>
-          <w:top w:val="none"/>
-          <w:left w:val="none"/>
-          <w:bottom w:val="none"/>
-          <w:right w:val="none"/>
-          <w:insideH w:val="none"/>
-          <w:insideV w:val="none"/>
-        </w:tblBorders>
-      </w:tblPr>
-      <w:tr>
-        <w:tc>
-          <w:tcPr>
-            <w:tcW w:w="3120" w:type="dxa"/>
-          </w:tcPr>
-          <w:p>
-            <w:pPr>
-              <w:jc w:val="center"/>
-              <w:spacing w:before="120" w:after="120" w:line="240" w:lineRule="auto"/>
-            </w:pPr>
-            <w:r>
-              <w:rPr>
-                <w:rFonts w:ascii="Arial" w:hAnsi="Arial" w:cs="Arial"/>
-                <w:color w:val="000000"/>
-                <w:sz w:val="22"/>
-                <w:szCs w:val="22"/>
-              </w:rPr>
-              <w:t xml:space="preserve">Prepared by:</w:t>
-            </w:r>
-          </w:p>
-        </w:tc>
-        <w:tc>
-          <w:tcPr>
-            <w:tcW w:w="3120" w:type="dxa"/>
-          </w:tcPr>
-          <w:p>
-            <w:pPr>
-              <w:jc w:val="center"/>
-              <w:spacing w:before="120" w:after="120" w:line="240" w:lineRule="auto"/>
-            </w:pPr>
-            <w:r>
-              <w:rPr>
-                <w:rFonts w:ascii="Arial" w:hAnsi="Arial" w:cs="Arial"/>
-                <w:color w:val="000000"/>
-                <w:sz w:val="22"/>
-                <w:szCs w:val="22"/>
-              </w:rPr>
-              <w:t xml:space="preserve">Checked by:</w:t>
-            </w:r>
-          </w:p>
-        </w:tc>
-        <w:tc>
-          <w:tcPr>
-            <w:tcW w:w="3120" w:type="dxa"/>
-          </w:tcPr>
-          <w:p>
-            <w:pPr>
-              <w:jc w:val="center"/>
-              <w:spacing w:before="120" w:after="120" w:line="240" w:lineRule="auto"/>
-            </w:pPr>
-            <w:r>
-              <w:rPr>
-                <w:rFonts w:ascii="Arial" w:hAnsi="Arial" w:cs="Arial"/>
-                <w:color w:val="000000"/>
-                <w:sz w:val="22"/>
-                <w:szCs w:val="22"/>
-              </w:rPr>
-              <w:t xml:space="preserve">Noted by:</w:t>
-            </w:r>
-          </w:p>
-        </w:tc>
-      </w:tr>
-      <w:tr>
-        <w:tc>
-          <w:tcPr>
-            <w:tcW w:w="3120" w:type="dxa"/>
-          </w:tcPr>
-          <w:p>
-            <w:pPr>
-              <w:spacing w:after="120" w:line="240" w:lineRule="auto"/>
-            </w:pPr>
-          </w:p>
-          <w:p>
-            <w:pPr>
-              <w:spacing w:after="120" w:line="240" w:lineRule="auto"/>
-            </w:pPr>
-          </w:p>
-          <w:p>
-            <w:pPr>
-              <w:jc w:val="center"/>
-              <w:spacing w:before="120" w:after="120" w:line="240" w:lineRule="auto"/>
-            </w:pPr>
-            <w:r>
-              <w:rPr>
-                <w:rFonts w:ascii="Arial" w:hAnsi="Arial" w:cs="Arial"/>
-                <w:b/>
-                <w:bCs/>
-                <w:color w:val="000000"/>
-                <w:sz w:val="22"/>
-                <w:szCs w:val="22"/>
-              </w:rPr>
-              <w:t xml:space="preserve">Rosalinda Espinar</w:t>
-            </w:r>
-          </w:p>
-          <w:p>
-            <w:pPr>
-              <w:jc w:val="center"/>
-              <w:spacing w:before="120" w:after="120" w:line="240" w:lineRule="auto"/>
-            </w:pPr>
-            <w:r>
-              <w:rPr>
-                <w:rFonts w:ascii="Arial" w:hAnsi="Arial" w:cs="Arial"/>
-                <w:color w:val="000000"/>
-                <w:sz w:val="22"/>
-                <w:szCs w:val="22"/>
-              </w:rPr>
-              <w:t xml:space="preserve">Incident Documentation Staff</w:t>
-            </w:r>
-          </w:p>
-        </w:tc>
-        <w:tc>
-          <w:tcPr>
-            <w:tcW w:w="3120" w:type="dxa"/>
-          </w:tcPr>
-          <w:p>
-            <w:pPr>
-              <w:spacing w:after="120" w:line="240" w:lineRule="auto"/>
-            </w:pPr>
-          </w:p>
-          <w:p>
-            <w:pPr>
-              <w:spacing w:after="120" w:line="240" w:lineRule="auto"/>
-            </w:pPr>
-          </w:p>
-          <w:p>
-            <w:pPr>
-              <w:jc w:val="center"/>
-              <w:spacing w:before="120" w:after="120" w:line="240" w:lineRule="auto"/>
-            </w:pPr>
-            <w:r>
-              <w:rPr>
-                <w:rFonts w:ascii="Arial" w:hAnsi="Arial" w:cs="Arial"/>
-                <w:b/>
-                <w:bCs/>
-                <w:color w:val="000000"/>
-                <w:sz w:val="22"/>
-                <w:szCs w:val="22"/>
-              </w:rPr>
-              <w:t xml:space="preserve">Giovanni Marco</w:t>
-            </w:r>
-          </w:p>
-          <w:p>
-            <w:pPr>
-              <w:jc w:val="center"/>
-              <w:spacing w:before="120" w:after="120" w:line="240" w:lineRule="auto"/>
-            </w:pPr>
-            <w:r>
-              <w:rPr>
-                <w:rFonts w:ascii="Arial" w:hAnsi="Arial" w:cs="Arial"/>
-                <w:color w:val="000000"/>
-                <w:sz w:val="22"/>
-                <w:szCs w:val="22"/>
-              </w:rPr>
-              <w:t xml:space="preserve">Operations-In-Charge</w:t>
-            </w:r>
-          </w:p>
-        </w:tc>
-        <w:tc>
-          <w:tcPr>
-            <w:tcW w:w="3120" w:type="dxa"/>
-          </w:tcPr>
-          <w:p>
-            <w:pPr>
-              <w:spacing w:after="120" w:line="240" w:lineRule="auto"/>
-            </w:pPr>
-          </w:p>
-          <w:p>
-            <w:pPr>
-              <w:spacing w:after="120" w:line="240" w:lineRule="auto"/>
-            </w:pPr>
-          </w:p>
-          <w:p>
-            <w:pPr>
-              <w:jc w:val="center"/>
-              <w:spacing w:before="120" w:after="120" w:line="240" w:lineRule="auto"/>
-            </w:pPr>
-            <w:r>
-              <w:rPr>
-                <w:rFonts w:ascii="Arial" w:hAnsi="Arial" w:cs="Arial"/>
-                <w:b/>
-                <w:bCs/>
-                <w:color w:val="000000"/>
-                <w:sz w:val="22"/>
-                <w:szCs w:val="22"/>
-              </w:rPr>
-              <w:t xml:space="preserve">Christian Noel Villanueva</w:t>
-            </w:r>
-          </w:p>
-          <w:p>
-            <w:pPr>
-              <w:jc w:val="center"/>
-              <w:spacing w:before="120" w:after="120" w:line="240" w:lineRule="auto"/>
-            </w:pPr>
-            <w:r>
-              <w:rPr>
-                <w:rFonts w:ascii="Arial" w:hAnsi="Arial" w:cs="Arial"/>
-                <w:color w:val="000000"/>
-                <w:sz w:val="22"/>
-                <w:szCs w:val="22"/>
-              </w:rPr>
-              <w:t xml:space="preserve">MGDH I – LDRRMO</w:t>
-            </w:r>
-          </w:p>
-        </w:tc>
-      </w:tr>
-    </w:tbl>
     <w:p>
       <w:pPr>
         <w:spacing w:after="120" w:line="240" w:lineRule="auto"/>
@@ -443,92 +225,217 @@
 </file>
 
 <file path=word/footer1.xml><?xml version="1.0" encoding="utf-8"?>
-<w:ftr xmlns:wpc="http://schemas.microsoft.com/office/word/2010/wordprocessingCanvas" xmlns:cx="http://schemas.microsoft.com/office/drawing/2014/chartex" xmlns:cx1="http://schemas.microsoft.com/office/drawing/2015/9/8/chartex" xmlns:cx2="http://schemas.microsoft.com/office/drawing/2015/10/21/chartex" xmlns:cx3="http://schemas.microsoft.com/office/drawing/2016/5/9/chartex" xmlns:cx4="http://schemas.microsoft.com/office/drawing/2016/5/10/chartex" xmlns:cx5="http://schemas.microsoft.com/office/drawing/2016/5/11/chartex" xmlns:cx6="http://schemas.microsoft.com/office/drawing/2016/5/12/chartex" xmlns:cx7="http://schemas.microsoft.com/office/drawing/2016/5/13/chartex" xmlns:cx8="http://schemas.microsoft.com/office/drawing/2016/5/14/chartex" xmlns:mc="http://schemas.openxmlformats.org/markup-compatibility/2006" xmlns:aink="http://schemas.microsoft.com/office/drawing/2016/ink" xmlns:am3d="http://schemas.microsoft.com/office/drawing/2017/model3d" xmlns:o="urn:schemas-microsoft-com:office:office" xmlns:r="http://schemas.openxmlformats.org/officeDocument/2006/relationships" xmlns:m="http://schemas.openxmlformats.org/officeDocument/2006/math" xmlns:v="urn:schemas-microsoft-com:vml" xmlns:wp14="http://schemas.microsoft.com/office/word/2010/wordprocessingDrawing" xmlns:wp="http://schemas.openxmlformats.org/drawingml/2006/wordprocessingDrawing" xmlns:w10="urn:schemas-microsoft-com:office:word" xmlns:w="http://schemas.openxmlformats.org/wordprocessingml/2006/main" xmlns:w14="http://schemas.microsoft.com/office/word/2010/wordml" xmlns:w15="http://schemas.microsoft.com/office/word/2012/wordml" xmlns:w16cex="http://schemas.microsoft.com/office/word/2018/wordml/cex" xmlns:w16cid="http://schemas.microsoft.com/office/word/2016/wordml/cid" xmlns:w16="http://schemas.microsoft.com/office/word/2018/wordml" xmlns:w16sdtdh="http://schemas.microsoft.com/office/word/2020/wordml/sdtdatahash" xmlns:w16se="http://schemas.microsoft.com/office/word/2015/wordml/symex" xmlns:wpg="http://schemas.microsoft.com/office/word/2010/wordprocessingGroup" xmlns:wpi="http://schemas.microsoft.com/office/word/2010/wordprocessingInk" xmlns:wne="http://schemas.microsoft.com/office/word/2006/wordml" xmlns:wps="http://schemas.microsoft.com/office/word/2010/wordprocessingShape" mc:Ignorable="w14 w15 w16se w16cid w16 w16cex w16sdtdh wp14">
-  <w:p>
-    <w:pPr>
-      <w:pStyle w:val="Footer"/>
-    </w:pPr>
-    <w:bookmarkStart w:id="0" w:name="_Hlk220927823"/>
-    <w:bookmarkStart w:id="1" w:name="_Hlk220927824"/>
-    <w:r>
-      <w:rPr>
-        <w:noProof/>
-        <w:lang w:eastAsia="en-PH"/>
-      </w:rPr>
-      <w:drawing>
-        <wp:anchor distT="0" distB="0" distL="114300" distR="114300" simplePos="0" relativeHeight="251661312" behindDoc="1" locked="0" layoutInCell="1" allowOverlap="1" wp14:anchorId="6FC6BD63" wp14:editId="365C749A">
-          <wp:simplePos x="0" y="0"/>
-          <wp:positionH relativeFrom="page">
-            <wp:posOffset>-6985</wp:posOffset>
-          </wp:positionH>
-          <wp:positionV relativeFrom="paragraph">
-            <wp:posOffset>-57640</wp:posOffset>
-          </wp:positionV>
-          <wp:extent cx="7780867" cy="817988"/>
-          <wp:effectExtent l="0" t="0" r="0" b="1270"/>
-          <wp:wrapNone/>
-          <wp:docPr id="24" name="Picture 2"/>
-          <wp:cNvGraphicFramePr>
-            <a:graphicFrameLocks xmlns:a="http://schemas.openxmlformats.org/drawingml/2006/main" noChangeAspect="1"/>
-          </wp:cNvGraphicFramePr>
-          <a:graphic xmlns:a="http://schemas.openxmlformats.org/drawingml/2006/main">
-            <a:graphicData uri="http://schemas.openxmlformats.org/drawingml/2006/picture">
-              <pic:pic xmlns:pic="http://schemas.openxmlformats.org/drawingml/2006/picture">
-                <pic:nvPicPr>
-                  <pic:cNvPr id="0" name="Picture 2"/>
-                  <pic:cNvPicPr>
-                    <a:picLocks noChangeAspect="1" noChangeArrowheads="1"/>
-                  </pic:cNvPicPr>
-                </pic:nvPicPr>
-                <pic:blipFill>
-                  <a:blip r:embed="rId1">
-                    <a:extLst>
-                      <a:ext uri="{28A0092B-C50C-407E-A947-70E740481C1C}">
-                        <a14:useLocalDpi xmlns:a14="http://schemas.microsoft.com/office/drawing/2010/main" val="0"/>
-                      </a:ext>
-                    </a:extLst>
-                  </a:blip>
-                  <a:srcRect/>
-                  <a:stretch>
-                    <a:fillRect/>
-                  </a:stretch>
-                </pic:blipFill>
-                <pic:spPr bwMode="auto">
-                  <a:xfrm>
-                    <a:off x="0" y="0"/>
-                    <a:ext cx="7780867" cy="817988"/>
-                  </a:xfrm>
-                  <a:prstGeom prst="rect">
-                    <a:avLst/>
-                  </a:prstGeom>
-                  <a:noFill/>
-                  <a:ln>
-                    <a:noFill/>
-                  </a:ln>
-                </pic:spPr>
-              </pic:pic>
-            </a:graphicData>
-          </a:graphic>
-          <wp14:sizeRelH relativeFrom="page">
-            <wp14:pctWidth>0</wp14:pctWidth>
-          </wp14:sizeRelH>
-          <wp14:sizeRelV relativeFrom="page">
-            <wp14:pctHeight>0</wp14:pctHeight>
-          </wp14:sizeRelV>
-        </wp:anchor>
-      </w:drawing>
-    </w:r>
-    <w:r>
-      <w:t>Hotline no. (0906) 636 4019</w:t>
-    </w:r>
-    <w:bookmarkEnd w:id="0"/>
-    <w:bookmarkEnd w:id="1"/>
-  </w:p>
-  <w:p>
-    <w:pPr>
-      <w:pStyle w:val="Footer"/>
-    </w:pPr>
-  </w:p>
+<w:ftr xmlns:wpc="http://schemas.microsoft.com/office/word/2010/wordprocessingCanvas" xmlns:mc="http://schemas.openxmlformats.org/markup-compatibility/2006" xmlns:o="urn:schemas-microsoft-com:office:office" xmlns:r="http://schemas.openxmlformats.org/officeDocument/2006/relationships" xmlns:m="http://schemas.openxmlformats.org/officeDocument/2006/math" xmlns:v="urn:schemas-microsoft-com:vml" xmlns:wp="http://schemas.openxmlformats.org/drawingml/2006/wordprocessingDrawing" xmlns:w10="urn:schemas-microsoft-com:office:word" xmlns:w="http://schemas.openxmlformats.org/wordprocessingml/2006/main" xmlns:w14="http://schemas.microsoft.com/office/word/2010/wordml" mc:Ignorable="w14">
+  <w:tbl>
+    <w:tblPr>
+      <w:tblW w:w="9360" w:type="dxa"/>
+      <w:jc w:val="center"/>
+      <w:tblBorders>
+        <w:top w:val="none"/>
+        <w:left w:val="none"/>
+        <w:bottom w:val="none"/>
+        <w:right w:val="none"/>
+        <w:insideH w:val="none"/>
+        <w:insideV w:val="none"/>
+      </w:tblBorders>
+      <w:tblCellMar>
+        <w:top w:w="0" w:type="dxa"/>
+        <w:bottom w:w="0" w:type="dxa"/>
+        <w:left w:w="40" w:type="dxa"/>
+        <w:right w:w="40" w:type="dxa"/>
+      </w:tblCellMar>
+    </w:tblPr>
+    <w:tr>
+      <w:tc>
+        <w:tcPr>
+          <w:tcW w:w="3120" w:type="dxa"/>
+        </w:tcPr>
+        <w:p>
+          <w:pPr>
+            <w:jc w:val="center"/>
+            <w:spacing w:before="40" w:after="40" w:line="240" w:lineRule="auto"/>
+          </w:pPr>
+          <w:r>
+            <w:rPr>
+              <w:rFonts w:ascii="Arial" w:hAnsi="Arial" w:cs="Arial"/>
+              <w:color w:val="000000"/>
+              <w:sz w:val="20"/>
+              <w:szCs w:val="20"/>
+            </w:rPr>
+            <w:t xml:space="preserve">Prepared by:</w:t>
+          </w:r>
+        </w:p>
+      </w:tc>
+      <w:tc>
+        <w:tcPr>
+          <w:tcW w:w="3120" w:type="dxa"/>
+        </w:tcPr>
+        <w:p>
+          <w:pPr>
+            <w:jc w:val="center"/>
+            <w:spacing w:before="40" w:after="40" w:line="240" w:lineRule="auto"/>
+          </w:pPr>
+          <w:r>
+            <w:rPr>
+              <w:rFonts w:ascii="Arial" w:hAnsi="Arial" w:cs="Arial"/>
+              <w:color w:val="000000"/>
+              <w:sz w:val="20"/>
+              <w:szCs w:val="20"/>
+            </w:rPr>
+            <w:t xml:space="preserve">Checked by:</w:t>
+          </w:r>
+        </w:p>
+      </w:tc>
+      <w:tc>
+        <w:tcPr>
+          <w:tcW w:w="3120" w:type="dxa"/>
+        </w:tcPr>
+        <w:p>
+          <w:pPr>
+            <w:jc w:val="center"/>
+            <w:spacing w:before="40" w:after="40" w:line="240" w:lineRule="auto"/>
+          </w:pPr>
+          <w:r>
+            <w:rPr>
+              <w:rFonts w:ascii="Arial" w:hAnsi="Arial" w:cs="Arial"/>
+              <w:color w:val="000000"/>
+              <w:sz w:val="20"/>
+              <w:szCs w:val="20"/>
+            </w:rPr>
+            <w:t xml:space="preserve">Noted by:</w:t>
+          </w:r>
+        </w:p>
+      </w:tc>
+    </w:tr>
+    <w:tr>
+      <w:tc>
+        <w:tcPr>
+          <w:tcW w:w="3120" w:type="dxa"/>
+        </w:tcPr>
+        <w:p>
+          <w:pPr>
+            <w:spacing w:after="60" w:line="240" w:lineRule="auto"/>
+          </w:pPr>
+        </w:p>
+        <w:p>
+          <w:pPr>
+            <w:jc w:val="center"/>
+            <w:spacing w:before="20" w:after="20" w:line="240" w:lineRule="auto"/>
+          </w:pPr>
+          <w:r>
+            <w:rPr>
+              <w:rFonts w:ascii="Arial" w:hAnsi="Arial" w:cs="Arial"/>
+              <w:b/>
+              <w:bCs/>
+              <w:color w:val="000000"/>
+              <w:sz w:val="22"/>
+              <w:szCs w:val="22"/>
+            </w:rPr>
+            <w:t xml:space="preserve">Rosalinda Espinar</w:t>
+          </w:r>
+        </w:p>
+        <w:p>
+          <w:pPr>
+            <w:jc w:val="center"/>
+            <w:spacing w:before="0" w:after="20" w:line="240" w:lineRule="auto"/>
+          </w:pPr>
+          <w:r>
+            <w:rPr>
+              <w:rFonts w:ascii="Arial" w:hAnsi="Arial" w:cs="Arial"/>
+              <w:color w:val="000000"/>
+              <w:sz w:val="18"/>
+              <w:szCs w:val="18"/>
+            </w:rPr>
+            <w:t xml:space="preserve">Incident Documentation Staff</w:t>
+          </w:r>
+        </w:p>
+      </w:tc>
+      <w:tc>
+        <w:tcPr>
+          <w:tcW w:w="3120" w:type="dxa"/>
+        </w:tcPr>
+        <w:p>
+          <w:pPr>
+            <w:spacing w:after="60" w:line="240" w:lineRule="auto"/>
+          </w:pPr>
+        </w:p>
+        <w:p>
+          <w:pPr>
+            <w:jc w:val="center"/>
+            <w:spacing w:before="20" w:after="20" w:line="240" w:lineRule="auto"/>
+          </w:pPr>
+          <w:r>
+            <w:rPr>
+              <w:rFonts w:ascii="Arial" w:hAnsi="Arial" w:cs="Arial"/>
+              <w:b/>
+              <w:bCs/>
+              <w:color w:val="000000"/>
+              <w:sz w:val="22"/>
+              <w:szCs w:val="22"/>
+            </w:rPr>
+            <w:t xml:space="preserve">Giovanni Marco</w:t>
+          </w:r>
+        </w:p>
+        <w:p>
+          <w:pPr>
+            <w:jc w:val="center"/>
+            <w:spacing w:before="0" w:after="20" w:line="240" w:lineRule="auto"/>
+          </w:pPr>
+          <w:r>
+            <w:rPr>
+              <w:rFonts w:ascii="Arial" w:hAnsi="Arial" w:cs="Arial"/>
+              <w:color w:val="000000"/>
+              <w:sz w:val="18"/>
+              <w:szCs w:val="18"/>
+            </w:rPr>
+            <w:t xml:space="preserve">Operations-In-Charge</w:t>
+          </w:r>
+        </w:p>
+      </w:tc>
+      <w:tc>
+        <w:tcPr>
+          <w:tcW w:w="3120" w:type="dxa"/>
+        </w:tcPr>
+        <w:p>
+          <w:pPr>
+            <w:spacing w:after="60" w:line="240" w:lineRule="auto"/>
+          </w:pPr>
+        </w:p>
+        <w:p>
+          <w:pPr>
+            <w:jc w:val="center"/>
+            <w:spacing w:before="20" w:after="20" w:line="240" w:lineRule="auto"/>
+          </w:pPr>
+          <w:r>
+            <w:rPr>
+              <w:rFonts w:ascii="Arial" w:hAnsi="Arial" w:cs="Arial"/>
+              <w:b/>
+              <w:bCs/>
+              <w:color w:val="000000"/>
+              <w:sz w:val="22"/>
+              <w:szCs w:val="22"/>
+            </w:rPr>
+            <w:t xml:space="preserve">Christian Noel Villanueva</w:t>
+          </w:r>
+        </w:p>
+        <w:p>
+          <w:pPr>
+            <w:jc w:val="center"/>
+            <w:spacing w:before="0" w:after="20" w:line="240" w:lineRule="auto"/>
+          </w:pPr>
+          <w:r>
+            <w:rPr>
+              <w:rFonts w:ascii="Arial" w:hAnsi="Arial" w:cs="Arial"/>
+              <w:color w:val="000000"/>
+              <w:sz w:val="18"/>
+              <w:szCs w:val="18"/>
+            </w:rPr>
+            <w:t xml:space="preserve">MGDH I – LDRRMO</w:t>
+          </w:r>
+        </w:p>
+      </w:tc>
+    </w:tr>
+  </w:tbl>
 </w:ftr>
 </file>
 

</xml_diff>

<commit_message>
feat(reports): engrave official signatures and Balayan skyline graphic together at page bottom
</commit_message>
<xml_diff>
--- a/public/templates/monthly-template.docx
+++ b/public/templates/monthly-template.docx
@@ -225,7 +225,7 @@
 </file>
 
 <file path=word/footer1.xml><?xml version="1.0" encoding="utf-8"?>
-<w:ftr xmlns:wpc="http://schemas.microsoft.com/office/word/2010/wordprocessingCanvas" xmlns:mc="http://schemas.openxmlformats.org/markup-compatibility/2006" xmlns:o="urn:schemas-microsoft-com:office:office" xmlns:r="http://schemas.openxmlformats.org/officeDocument/2006/relationships" xmlns:m="http://schemas.openxmlformats.org/officeDocument/2006/math" xmlns:v="urn:schemas-microsoft-com:vml" xmlns:wp="http://schemas.openxmlformats.org/drawingml/2006/wordprocessingDrawing" xmlns:w10="urn:schemas-microsoft-com:office:word" xmlns:w="http://schemas.openxmlformats.org/wordprocessingml/2006/main" xmlns:w14="http://schemas.microsoft.com/office/word/2010/wordml" mc:Ignorable="w14">
+<w:ftr xmlns:wpc="http://schemas.microsoft.com/office/word/2010/wordprocessingCanvas" xmlns:cx="http://schemas.microsoft.com/office/drawing/2014/chartex" xmlns:cx1="http://schemas.microsoft.com/office/drawing/2015/9/8/chartex" xmlns:cx2="http://schemas.microsoft.com/office/drawing/2015/10/21/chartex" xmlns:cx3="http://schemas.microsoft.com/office/drawing/2016/5/9/chartex" xmlns:cx4="http://schemas.microsoft.com/office/drawing/2016/5/10/chartex" xmlns:cx5="http://schemas.microsoft.com/office/drawing/2016/5/11/chartex" xmlns:cx6="http://schemas.microsoft.com/office/drawing/2016/5/12/chartex" xmlns:cx7="http://schemas.microsoft.com/office/drawing/2016/5/13/chartex" xmlns:cx8="http://schemas.microsoft.com/office/drawing/2016/5/14/chartex" xmlns:mc="http://schemas.openxmlformats.org/markup-compatibility/2006" xmlns:aink="http://schemas.microsoft.com/office/drawing/2016/ink" xmlns:am3d="http://schemas.microsoft.com/office/drawing/2017/model3d" xmlns:o="urn:schemas-microsoft-com:office:office" xmlns:r="http://schemas.openxmlformats.org/officeDocument/2006/relationships" xmlns:m="http://schemas.openxmlformats.org/officeDocument/2006/math" xmlns:v="urn:schemas-microsoft-com:vml" xmlns:wp14="http://schemas.microsoft.com/office/word/2010/wordprocessingDrawing" xmlns:wp="http://schemas.openxmlformats.org/drawingml/2006/wordprocessingDrawing" xmlns:w10="urn:schemas-microsoft-com:office:word" xmlns:w="http://schemas.openxmlformats.org/wordprocessingml/2006/main" xmlns:w14="http://schemas.microsoft.com/office/word/2010/wordml" xmlns:w15="http://schemas.microsoft.com/office/word/2012/wordml" xmlns:w16cex="http://schemas.microsoft.com/office/word/2018/wordml/cex" xmlns:w16cid="http://schemas.microsoft.com/office/word/2016/wordml/cid" xmlns:w16="http://schemas.microsoft.com/office/word/2018/wordml" xmlns:w16sdtdh="http://schemas.microsoft.com/office/word/2020/wordml/sdtdatahash" xmlns:w16se="http://schemas.microsoft.com/office/word/2015/wordml/symex" xmlns:wpg="http://schemas.microsoft.com/office/word/2010/wordprocessingGroup" xmlns:wpi="http://schemas.microsoft.com/office/word/2010/wordprocessingInk" xmlns:wne="http://schemas.microsoft.com/office/word/2006/wordml" xmlns:wps="http://schemas.microsoft.com/office/word/2010/wordprocessingShape" mc:Ignorable="w14 w15 w16se w16cid w16 w16cex w16sdtdh wp14">
   <w:tbl>
     <w:tblPr>
       <w:tblW w:w="9360" w:type="dxa"/>
@@ -253,7 +253,7 @@
         <w:p>
           <w:pPr>
             <w:jc w:val="center"/>
-            <w:spacing w:before="40" w:after="40" w:line="240" w:lineRule="auto"/>
+            <w:spacing w:before="20" w:after="20" w:line="240" w:lineRule="auto"/>
           </w:pPr>
           <w:r>
             <w:rPr>
@@ -273,7 +273,7 @@
         <w:p>
           <w:pPr>
             <w:jc w:val="center"/>
-            <w:spacing w:before="40" w:after="40" w:line="240" w:lineRule="auto"/>
+            <w:spacing w:before="20" w:after="20" w:line="240" w:lineRule="auto"/>
           </w:pPr>
           <w:r>
             <w:rPr>
@@ -293,7 +293,7 @@
         <w:p>
           <w:pPr>
             <w:jc w:val="center"/>
-            <w:spacing w:before="40" w:after="40" w:line="240" w:lineRule="auto"/>
+            <w:spacing w:before="20" w:after="20" w:line="240" w:lineRule="auto"/>
           </w:pPr>
           <w:r>
             <w:rPr>
@@ -314,13 +314,13 @@
         </w:tcPr>
         <w:p>
           <w:pPr>
-            <w:spacing w:after="60" w:line="240" w:lineRule="auto"/>
+            <w:spacing w:after="30" w:line="240" w:lineRule="auto"/>
           </w:pPr>
         </w:p>
         <w:p>
           <w:pPr>
             <w:jc w:val="center"/>
-            <w:spacing w:before="20" w:after="20" w:line="240" w:lineRule="auto"/>
+            <w:spacing w:before="10" w:after="10" w:line="240" w:lineRule="auto"/>
           </w:pPr>
           <w:r>
             <w:rPr>
@@ -337,7 +337,7 @@
         <w:p>
           <w:pPr>
             <w:jc w:val="center"/>
-            <w:spacing w:before="0" w:after="20" w:line="240" w:lineRule="auto"/>
+            <w:spacing w:before="0" w:after="10" w:line="240" w:lineRule="auto"/>
           </w:pPr>
           <w:r>
             <w:rPr>
@@ -356,13 +356,13 @@
         </w:tcPr>
         <w:p>
           <w:pPr>
-            <w:spacing w:after="60" w:line="240" w:lineRule="auto"/>
+            <w:spacing w:after="30" w:line="240" w:lineRule="auto"/>
           </w:pPr>
         </w:p>
         <w:p>
           <w:pPr>
             <w:jc w:val="center"/>
-            <w:spacing w:before="20" w:after="20" w:line="240" w:lineRule="auto"/>
+            <w:spacing w:before="10" w:after="10" w:line="240" w:lineRule="auto"/>
           </w:pPr>
           <w:r>
             <w:rPr>
@@ -379,7 +379,7 @@
         <w:p>
           <w:pPr>
             <w:jc w:val="center"/>
-            <w:spacing w:before="0" w:after="20" w:line="240" w:lineRule="auto"/>
+            <w:spacing w:before="0" w:after="10" w:line="240" w:lineRule="auto"/>
           </w:pPr>
           <w:r>
             <w:rPr>
@@ -398,13 +398,13 @@
         </w:tcPr>
         <w:p>
           <w:pPr>
-            <w:spacing w:after="60" w:line="240" w:lineRule="auto"/>
+            <w:spacing w:after="30" w:line="240" w:lineRule="auto"/>
           </w:pPr>
         </w:p>
         <w:p>
           <w:pPr>
             <w:jc w:val="center"/>
-            <w:spacing w:before="20" w:after="20" w:line="240" w:lineRule="auto"/>
+            <w:spacing w:before="10" w:after="10" w:line="240" w:lineRule="auto"/>
           </w:pPr>
           <w:r>
             <w:rPr>
@@ -421,7 +421,7 @@
         <w:p>
           <w:pPr>
             <w:jc w:val="center"/>
-            <w:spacing w:before="0" w:after="20" w:line="240" w:lineRule="auto"/>
+            <w:spacing w:before="0" w:after="10" w:line="240" w:lineRule="auto"/>
           </w:pPr>
           <w:r>
             <w:rPr>
@@ -436,6 +436,89 @@
       </w:tc>
     </w:tr>
   </w:tbl>
+  <w:p>
+    <w:pPr>
+      <w:pStyle w:val="Footer"/>
+      <w:spacing w:before="140" w:after="0" w:line="240" w:lineRule="auto"/>
+    </w:pPr>
+    <w:r>
+      <w:rPr>
+        <w:noProof/>
+        <w:lang w:eastAsia="en-PH"/>
+      </w:rPr>
+      <w:drawing>
+        <wp:anchor distT="0" distB="0" distL="114300" distR="114300" simplePos="0" relativeHeight="251656192" behindDoc="1" locked="0" layoutInCell="1" allowOverlap="1" wp14:anchorId="03B7B224" wp14:editId="41AAECDD">
+          <wp:simplePos x="0" y="0"/>
+          <wp:positionH relativeFrom="page">
+            <wp:align>right</wp:align>
+          </wp:positionH>
+          <wp:positionV relativeFrom="paragraph">
+            <wp:posOffset>0</wp:posOffset>
+          </wp:positionV>
+          <wp:extent cx="7780867" cy="817988"/>
+          <wp:effectExtent l="0" t="0" r="0" b="1270"/>
+          <wp:wrapNone/>
+          <wp:docPr id="264428439" name="Picture 2"/>
+          <wp:cNvGraphicFramePr>
+            <a:graphicFrameLocks xmlns:a="http://schemas.openxmlformats.org/drawingml/2006/main" noChangeAspect="1"/>
+          </wp:cNvGraphicFramePr>
+          <a:graphic xmlns:a="http://schemas.openxmlformats.org/drawingml/2006/main">
+            <a:graphicData uri="http://schemas.openxmlformats.org/drawingml/2006/picture">
+              <pic:pic xmlns:pic="http://schemas.openxmlformats.org/drawingml/2006/picture">
+                <pic:nvPicPr>
+                  <pic:cNvPr id="0" name="Picture 2"/>
+                  <pic:cNvPicPr>
+                    <a:picLocks noChangeAspect="1" noChangeArrowheads="1"/>
+                  </pic:cNvPicPr>
+                </pic:nvPicPr>
+                <pic:blipFill>
+                  <a:blip r:embed="rId1">
+                    <a:extLst>
+                      <a:ext uri="{28A0092B-C50C-407E-A947-70E740481C1C}">
+                        <a14:useLocalDpi xmlns:a14="http://schemas.microsoft.com/office/drawing/2010/main" val="0"/>
+                      </a:ext>
+                    </a:extLst>
+                  </a:blip>
+                  <a:srcRect/>
+                  <a:stretch>
+                    <a:fillRect/>
+                  </a:stretch>
+                </pic:blipFill>
+                <pic:spPr bwMode="auto">
+                  <a:xfrm>
+                    <a:off x="0" y="0"/>
+                    <a:ext cx="7780867" cy="817988"/>
+                  </a:xfrm>
+                  <a:prstGeom prst="rect">
+                    <a:avLst/>
+                  </a:prstGeom>
+                  <a:noFill/>
+                  <a:ln>
+                    <a:noFill/>
+                  </a:ln>
+                </pic:spPr>
+              </pic:pic>
+            </a:graphicData>
+          </a:graphic>
+          <wp14:sizeRelH relativeFrom="page">
+            <wp14:pctWidth>0</wp14:pctWidth>
+          </wp14:sizeRelH>
+          <wp14:sizeRelV relativeFrom="page">
+            <wp14:pctHeight>0</wp14:pctHeight>
+          </wp14:sizeRelV>
+        </wp:anchor>
+      </w:drawing>
+    </w:r>
+    <w:r>
+      <w:rPr>
+        <w:rFonts w:ascii="Arial" w:hAnsi="Arial" w:cs="Arial"/>
+        <w:color w:val="808080"/>
+        <w:sz w:val="20"/>
+        <w:szCs w:val="20"/>
+      </w:rPr>
+      <w:t>Hotline no. (0906) 636 4019</w:t>
+    </w:r>
+  </w:p>
 </w:ftr>
 </file>
 

</xml_diff>